<commit_message>
Created Research Progress Report
</commit_message>
<xml_diff>
--- a/Reports/CS699Report10192025.docx
+++ b/Reports/CS699Report10192025.docx
@@ -69,39 +69,7 @@
           <w:sz w:val="32"/>
           <w:szCs w:val="32"/>
         </w:rPr>
-        <w:t>10</w:t>
-      </w:r>
-      <w:r>
-        <w:rPr>
-          <w:rFonts w:ascii="Times New Roman" w:hAnsi="Times New Roman" w:cs="Times New Roman"/>
-          <w:sz w:val="32"/>
-          <w:szCs w:val="32"/>
-        </w:rPr>
-        <w:t>/</w:t>
-      </w:r>
-      <w:r>
-        <w:rPr>
-          <w:rFonts w:ascii="Times New Roman" w:hAnsi="Times New Roman" w:cs="Times New Roman"/>
-          <w:sz w:val="32"/>
-          <w:szCs w:val="32"/>
-        </w:rPr>
-        <w:t>19</w:t>
-      </w:r>
-      <w:r>
-        <w:rPr>
-          <w:rFonts w:ascii="Times New Roman" w:hAnsi="Times New Roman" w:cs="Times New Roman"/>
-          <w:sz w:val="32"/>
-          <w:szCs w:val="32"/>
-        </w:rPr>
-        <w:t>/20</w:t>
-      </w:r>
-      <w:r>
-        <w:rPr>
-          <w:rFonts w:ascii="Times New Roman" w:hAnsi="Times New Roman" w:cs="Times New Roman"/>
-          <w:sz w:val="32"/>
-          <w:szCs w:val="32"/>
-        </w:rPr>
-        <w:t>25</w:t>
+        <w:t>10/19/2025</w:t>
       </w:r>
     </w:p>
     <w:p>
@@ -135,7 +103,25 @@
           <w:sz w:val="24"/>
           <w:szCs w:val="24"/>
         </w:rPr>
-        <w:t>Over the last several weeks I have been working on my thesis project to get to a complete stage with results to use as source material for my thesis document. I have also been planning out the document sections in order to start compiling my thesis paper.</w:t>
+        <w:t xml:space="preserve">Over the last several weeks, I have been diligently working on my thesis project to reach a complete stage with results that can be used as source material for my thesis document. Additionally, I have been working </w:t>
+      </w:r>
+      <w:proofErr w:type="gramStart"/>
+      <w:r>
+        <w:rPr>
+          <w:rFonts w:ascii="Times New Roman" w:hAnsi="Times New Roman" w:cs="Times New Roman"/>
+          <w:sz w:val="24"/>
+          <w:szCs w:val="24"/>
+        </w:rPr>
+        <w:t>with</w:t>
+      </w:r>
+      <w:proofErr w:type="gramEnd"/>
+      <w:r>
+        <w:rPr>
+          <w:rFonts w:ascii="Times New Roman" w:hAnsi="Times New Roman" w:cs="Times New Roman"/>
+          <w:sz w:val="24"/>
+          <w:szCs w:val="24"/>
+        </w:rPr>
+        <w:t xml:space="preserve"> the Latex document to create an outline to fill out as I generate material.</w:t>
       </w:r>
     </w:p>
     <w:p>
@@ -202,7 +188,7 @@
           <w:sz w:val="24"/>
           <w:szCs w:val="24"/>
         </w:rPr>
-        <w:t xml:space="preserve"> </w:t>
+        <w:t xml:space="preserve">, </w:t>
       </w:r>
       <w:r>
         <w:rPr>
@@ -218,15 +204,51 @@
           <w:sz w:val="24"/>
           <w:szCs w:val="24"/>
         </w:rPr>
-        <w:t xml:space="preserve">made extensive strides in the project application to agile data. I went through the dataset to assign TSA values to all the rows. This is important because it allows individual lines to be compared to each other and therefore the different datasets to compared as well through empirical means. Following, I had to go through the process to import the corrected data into the project, and then </w:t>
-      </w:r>
-      <w:r>
-        <w:rPr>
-          <w:rFonts w:ascii="Times New Roman" w:hAnsi="Times New Roman" w:cs="Times New Roman"/>
-          <w:sz w:val="24"/>
-          <w:szCs w:val="24"/>
-        </w:rPr>
-        <w:t>perform wrangling to remove duplicated data, rows with empty fields, and unnecessary data that was added to the datasets. I also had to reform the dataset to be in a sprint centric format instead of a meeting centric format. Meaning that originally the data had all the sprints for the entire PI in each of the excel tables correlated to each Agile meeting. However, the data needed to be formatted so that each sprint contained all of the different meeting data types. Basically, moving from a column segmented dataset to a row segmented dataset. I was able to import this new data into the project and clean it and segment it into simulations so that they can be used to train and test the models. The last step is to run the models with the new data and use the results to determine if there are any valuable findings in the data. These findings can be used to make figures and also determine if there is needed optimization for the models used.</w:t>
+        <w:t xml:space="preserve">made extensive strides in the project application to agile data. I went through the dataset to assign TSA values to all the rows. This is important because it allows individual lines to be compared to each other and, therefore, the different datasets to be compared as well through empirical means. Following, I had to go through the process to import the corrected data into the project, and then </w:t>
+      </w:r>
+      <w:r>
+        <w:rPr>
+          <w:rFonts w:ascii="Times New Roman" w:hAnsi="Times New Roman" w:cs="Times New Roman"/>
+          <w:sz w:val="24"/>
+          <w:szCs w:val="24"/>
+        </w:rPr>
+        <w:t xml:space="preserve">perform wrangling to remove duplicated data, rows with empty fields, and unnecessary data that was added to the datasets. I also had to reform the dataset to be in a sprint-centric format instead of a meeting-centric format. Meaning that originally the data had all the sprints for the entire PI in each of the Excel tables correlated to each Agile meeting. However, the data needed to be formatted so that each sprint contained </w:t>
+      </w:r>
+      <w:proofErr w:type="gramStart"/>
+      <w:r>
+        <w:rPr>
+          <w:rFonts w:ascii="Times New Roman" w:hAnsi="Times New Roman" w:cs="Times New Roman"/>
+          <w:sz w:val="24"/>
+          <w:szCs w:val="24"/>
+        </w:rPr>
+        <w:t>all of</w:t>
+      </w:r>
+      <w:proofErr w:type="gramEnd"/>
+      <w:r>
+        <w:rPr>
+          <w:rFonts w:ascii="Times New Roman" w:hAnsi="Times New Roman" w:cs="Times New Roman"/>
+          <w:sz w:val="24"/>
+          <w:szCs w:val="24"/>
+        </w:rPr>
+        <w:t xml:space="preserve"> the different meeting data types. Moving from a column-segmented dataset to a row-segmented dataset. I was able to import this new data into the project, clean it, and segment it into simulations so that they can be used to train and test the models. The last step is to run the models with the new data and use the results to determine if there are any valuable findings in the data. These findings can be used to make figures </w:t>
+      </w:r>
+      <w:proofErr w:type="gramStart"/>
+      <w:r>
+        <w:rPr>
+          <w:rFonts w:ascii="Times New Roman" w:hAnsi="Times New Roman" w:cs="Times New Roman"/>
+          <w:sz w:val="24"/>
+          <w:szCs w:val="24"/>
+        </w:rPr>
+        <w:t>and also</w:t>
+      </w:r>
+      <w:proofErr w:type="gramEnd"/>
+      <w:r>
+        <w:rPr>
+          <w:rFonts w:ascii="Times New Roman" w:hAnsi="Times New Roman" w:cs="Times New Roman"/>
+          <w:sz w:val="24"/>
+          <w:szCs w:val="24"/>
+        </w:rPr>
+        <w:t xml:space="preserve"> determine if there is a need for optimization for the models used.</w:t>
       </w:r>
     </w:p>
     <w:p>
@@ -269,15 +291,15 @@
           <w:sz w:val="24"/>
           <w:szCs w:val="24"/>
         </w:rPr>
-        <w:t>I have done some work to create an outline for the paper. I also worked on getting the Latex project to compile properly but was having problems with Overleaf. The next step is to move the Overleaf project I have under your ownership so that I can compile my document and begin populating the sections with content.</w:t>
-      </w:r>
-      <w:r>
-        <w:rPr>
-          <w:rFonts w:ascii="Times New Roman" w:hAnsi="Times New Roman" w:cs="Times New Roman"/>
-          <w:sz w:val="24"/>
-          <w:szCs w:val="24"/>
-        </w:rPr>
-        <w:t xml:space="preserve"> The basic outline is as follows: Abstract, Summary/wrap-up (Previous thesis work), Methods and Means, Data Creation, Model Creation, Results/Analysis, and Next Steps/Future work. This is based off of previous conversations and continuing work.</w:t>
+        <w:t>While I have made progress in creating an outline for the paper, I encountered some challenges in getting the LaTeX project to compile correctly, particularly with Overleaf. The next step is to transfer the Overleaf project I have under your ownership so that I can compile my document and begin populating the sections with content.</w:t>
+      </w:r>
+      <w:r>
+        <w:rPr>
+          <w:rFonts w:ascii="Times New Roman" w:hAnsi="Times New Roman" w:cs="Times New Roman"/>
+          <w:sz w:val="24"/>
+          <w:szCs w:val="24"/>
+        </w:rPr>
+        <w:t xml:space="preserve"> The basic outline, which includes Abstract, Summary/wrap-up (Previous thesis work), Methods and Means, Data Creation, Model Creation, Results/Analysis, and Next Steps/Future work, is based on our previous conversations and ongoing work.</w:t>
       </w:r>
     </w:p>
     <w:sectPr>
@@ -290,63 +312,13 @@
 </w:document>
 </file>
 
-<file path=word/endnotes.xml><?xml version="1.0" encoding="utf-8"?>
-<w:endnotes xmlns:wpc="http://schemas.microsoft.com/office/word/2010/wordprocessingCanvas" xmlns:cx="http://schemas.microsoft.com/office/drawing/2014/chartex" xmlns:cx1="http://schemas.microsoft.com/office/drawing/2015/9/8/chartex" xmlns:cx2="http://schemas.microsoft.com/office/drawing/2015/10/21/chartex" xmlns:cx3="http://schemas.microsoft.com/office/drawing/2016/5/9/chartex" xmlns:cx4="http://schemas.microsoft.com/office/drawing/2016/5/10/chartex" xmlns:cx5="http://schemas.microsoft.com/office/drawing/2016/5/11/chartex" xmlns:cx6="http://schemas.microsoft.com/office/drawing/2016/5/12/chartex" xmlns:cx7="http://schemas.microsoft.com/office/drawing/2016/5/13/chartex" xmlns:cx8="http://schemas.microsoft.com/office/drawing/2016/5/14/chartex" xmlns:mc="http://schemas.openxmlformats.org/markup-compatibility/2006" xmlns:aink="http://schemas.microsoft.com/office/drawing/2016/ink" xmlns:am3d="http://schemas.microsoft.com/office/drawing/2017/model3d" xmlns:o="urn:schemas-microsoft-com:office:office" xmlns:oel="http://schemas.microsoft.com/office/2019/extlst" xmlns:r="http://schemas.openxmlformats.org/officeDocument/2006/relationships" xmlns:m="http://schemas.openxmlformats.org/officeDocument/2006/math" xmlns:v="urn:schemas-microsoft-com:vml" xmlns:wp14="http://schemas.microsoft.com/office/word/2010/wordprocessingDrawing" xmlns:wp="http://schemas.openxmlformats.org/drawingml/2006/wordprocessingDrawing" xmlns:w10="urn:schemas-microsoft-com:office:word" xmlns:w="http://schemas.openxmlformats.org/wordprocessingml/2006/main" xmlns:w14="http://schemas.microsoft.com/office/word/2010/wordml" xmlns:w15="http://schemas.microsoft.com/office/word/2012/wordml" xmlns:w16cex="http://schemas.microsoft.com/office/word/2018/wordml/cex" xmlns:w16cid="http://schemas.microsoft.com/office/word/2016/wordml/cid" xmlns:w16="http://schemas.microsoft.com/office/word/2018/wordml" xmlns:w16du="http://schemas.microsoft.com/office/word/2023/wordml/word16du" xmlns:w16sdtdh="http://schemas.microsoft.com/office/word/2020/wordml/sdtdatahash" xmlns:w16sdtfl="http://schemas.microsoft.com/office/word/2024/wordml/sdtformatlock" xmlns:w16se="http://schemas.microsoft.com/office/word/2015/wordml/symex" xmlns:wpg="http://schemas.microsoft.com/office/word/2010/wordprocessingGroup" xmlns:wpi="http://schemas.microsoft.com/office/word/2010/wordprocessingInk" xmlns:wne="http://schemas.microsoft.com/office/word/2006/wordml" xmlns:wps="http://schemas.microsoft.com/office/word/2010/wordprocessingShape" mc:Ignorable="w14 w15 w16se w16cid w16 w16cex w16sdtdh w16sdtfl w16du wp14">
-  <w:endnote w:type="separator" w:id="-1">
-    <w:p>
-      <w:pPr>
-        <w:spacing w:after="0" w:line="240" w:lineRule="auto"/>
-      </w:pPr>
-      <w:r>
-        <w:separator/>
-      </w:r>
-    </w:p>
-  </w:endnote>
-  <w:endnote w:type="continuationSeparator" w:id="0">
-    <w:p>
-      <w:pPr>
-        <w:spacing w:after="0" w:line="240" w:lineRule="auto"/>
-      </w:pPr>
-      <w:r>
-        <w:continuationSeparator/>
-      </w:r>
-    </w:p>
-  </w:endnote>
-</w:endnotes>
-</file>
-
-<file path=word/footnotes.xml><?xml version="1.0" encoding="utf-8"?>
-<w:footnotes xmlns:wpc="http://schemas.microsoft.com/office/word/2010/wordprocessingCanvas" xmlns:cx="http://schemas.microsoft.com/office/drawing/2014/chartex" xmlns:cx1="http://schemas.microsoft.com/office/drawing/2015/9/8/chartex" xmlns:cx2="http://schemas.microsoft.com/office/drawing/2015/10/21/chartex" xmlns:cx3="http://schemas.microsoft.com/office/drawing/2016/5/9/chartex" xmlns:cx4="http://schemas.microsoft.com/office/drawing/2016/5/10/chartex" xmlns:cx5="http://schemas.microsoft.com/office/drawing/2016/5/11/chartex" xmlns:cx6="http://schemas.microsoft.com/office/drawing/2016/5/12/chartex" xmlns:cx7="http://schemas.microsoft.com/office/drawing/2016/5/13/chartex" xmlns:cx8="http://schemas.microsoft.com/office/drawing/2016/5/14/chartex" xmlns:mc="http://schemas.openxmlformats.org/markup-compatibility/2006" xmlns:aink="http://schemas.microsoft.com/office/drawing/2016/ink" xmlns:am3d="http://schemas.microsoft.com/office/drawing/2017/model3d" xmlns:o="urn:schemas-microsoft-com:office:office" xmlns:oel="http://schemas.microsoft.com/office/2019/extlst" xmlns:r="http://schemas.openxmlformats.org/officeDocument/2006/relationships" xmlns:m="http://schemas.openxmlformats.org/officeDocument/2006/math" xmlns:v="urn:schemas-microsoft-com:vml" xmlns:wp14="http://schemas.microsoft.com/office/word/2010/wordprocessingDrawing" xmlns:wp="http://schemas.openxmlformats.org/drawingml/2006/wordprocessingDrawing" xmlns:w10="urn:schemas-microsoft-com:office:word" xmlns:w="http://schemas.openxmlformats.org/wordprocessingml/2006/main" xmlns:w14="http://schemas.microsoft.com/office/word/2010/wordml" xmlns:w15="http://schemas.microsoft.com/office/word/2012/wordml" xmlns:w16cex="http://schemas.microsoft.com/office/word/2018/wordml/cex" xmlns:w16cid="http://schemas.microsoft.com/office/word/2016/wordml/cid" xmlns:w16="http://schemas.microsoft.com/office/word/2018/wordml" xmlns:w16du="http://schemas.microsoft.com/office/word/2023/wordml/word16du" xmlns:w16sdtdh="http://schemas.microsoft.com/office/word/2020/wordml/sdtdatahash" xmlns:w16sdtfl="http://schemas.microsoft.com/office/word/2024/wordml/sdtformatlock" xmlns:w16se="http://schemas.microsoft.com/office/word/2015/wordml/symex" xmlns:wpg="http://schemas.microsoft.com/office/word/2010/wordprocessingGroup" xmlns:wpi="http://schemas.microsoft.com/office/word/2010/wordprocessingInk" xmlns:wne="http://schemas.microsoft.com/office/word/2006/wordml" xmlns:wps="http://schemas.microsoft.com/office/word/2010/wordprocessingShape" mc:Ignorable="w14 w15 w16se w16cid w16 w16cex w16sdtdh w16sdtfl w16du wp14">
-  <w:footnote w:type="separator" w:id="-1">
-    <w:p>
-      <w:pPr>
-        <w:spacing w:after="0" w:line="240" w:lineRule="auto"/>
-      </w:pPr>
-      <w:r>
-        <w:separator/>
-      </w:r>
-    </w:p>
-  </w:footnote>
-  <w:footnote w:type="continuationSeparator" w:id="0">
-    <w:p>
-      <w:pPr>
-        <w:spacing w:after="0" w:line="240" w:lineRule="auto"/>
-      </w:pPr>
-      <w:r>
-        <w:continuationSeparator/>
-      </w:r>
-    </w:p>
-  </w:footnote>
-</w:footnotes>
-</file>
-
 <file path=word/numbering.xml><?xml version="1.0" encoding="utf-8"?>
 <w:numbering xmlns:wpc="http://schemas.microsoft.com/office/word/2010/wordprocessingCanvas" xmlns:cx="http://schemas.microsoft.com/office/drawing/2014/chartex" xmlns:cx1="http://schemas.microsoft.com/office/drawing/2015/9/8/chartex" xmlns:cx2="http://schemas.microsoft.com/office/drawing/2015/10/21/chartex" xmlns:cx3="http://schemas.microsoft.com/office/drawing/2016/5/9/chartex" xmlns:cx4="http://schemas.microsoft.com/office/drawing/2016/5/10/chartex" xmlns:cx5="http://schemas.microsoft.com/office/drawing/2016/5/11/chartex" xmlns:cx6="http://schemas.microsoft.com/office/drawing/2016/5/12/chartex" xmlns:cx7="http://schemas.microsoft.com/office/drawing/2016/5/13/chartex" xmlns:cx8="http://schemas.microsoft.com/office/drawing/2016/5/14/chartex" xmlns:mc="http://schemas.openxmlformats.org/markup-compatibility/2006" xmlns:aink="http://schemas.microsoft.com/office/drawing/2016/ink" xmlns:am3d="http://schemas.microsoft.com/office/drawing/2017/model3d" xmlns:o="urn:schemas-microsoft-com:office:office" xmlns:oel="http://schemas.microsoft.com/office/2019/extlst" xmlns:r="http://schemas.openxmlformats.org/officeDocument/2006/relationships" xmlns:m="http://schemas.openxmlformats.org/officeDocument/2006/math" xmlns:v="urn:schemas-microsoft-com:vml" xmlns:wp14="http://schemas.microsoft.com/office/word/2010/wordprocessingDrawing" xmlns:wp="http://schemas.openxmlformats.org/drawingml/2006/wordprocessingDrawing" xmlns:w10="urn:schemas-microsoft-com:office:word" xmlns:w="http://schemas.openxmlformats.org/wordprocessingml/2006/main" xmlns:w14="http://schemas.microsoft.com/office/word/2010/wordml" xmlns:w15="http://schemas.microsoft.com/office/word/2012/wordml" xmlns:w16cex="http://schemas.microsoft.com/office/word/2018/wordml/cex" xmlns:w16cid="http://schemas.microsoft.com/office/word/2016/wordml/cid" xmlns:w16="http://schemas.microsoft.com/office/word/2018/wordml" xmlns:w16du="http://schemas.microsoft.com/office/word/2023/wordml/word16du" xmlns:w16sdtdh="http://schemas.microsoft.com/office/word/2020/wordml/sdtdatahash" xmlns:w16sdtfl="http://schemas.microsoft.com/office/word/2024/wordml/sdtformatlock" xmlns:w16se="http://schemas.microsoft.com/office/word/2015/wordml/symex" xmlns:wpg="http://schemas.microsoft.com/office/word/2010/wordprocessingGroup" xmlns:wpi="http://schemas.microsoft.com/office/word/2010/wordprocessingInk" xmlns:wne="http://schemas.microsoft.com/office/word/2006/wordml" xmlns:wps="http://schemas.microsoft.com/office/word/2010/wordprocessingShape" mc:Ignorable="w14 w15 w16se w16cid w16 w16cex w16sdtdh w16sdtfl w16du wp14">
   <w:abstractNum w:abstractNumId="0" w15:restartNumberingAfterBreak="0">
     <w:nsid w:val="653874EB"/>
     <w:multiLevelType w:val="hybridMultilevel"/>
     <w:tmpl w:val="3FAAF00E"/>
-    <w:lvl w:ilvl="0" w:tplc="0409000F">
+    <w:lvl w:ilvl="0" w:tplc="FEC0D1D6">
       <w:start w:val="1"/>
       <w:numFmt w:val="decimal"/>
       <w:lvlText w:val="%1."/>
@@ -355,7 +327,7 @@
         <w:ind w:left="720" w:hanging="360"/>
       </w:pPr>
     </w:lvl>
-    <w:lvl w:ilvl="1" w:tplc="04090019">
+    <w:lvl w:ilvl="1" w:tplc="792E518C">
       <w:start w:val="1"/>
       <w:numFmt w:val="lowerLetter"/>
       <w:lvlText w:val="%2."/>
@@ -364,7 +336,7 @@
         <w:ind w:left="1440" w:hanging="360"/>
       </w:pPr>
     </w:lvl>
-    <w:lvl w:ilvl="2" w:tplc="0409001B" w:tentative="1">
+    <w:lvl w:ilvl="2" w:tplc="DF66E15E" w:tentative="1">
       <w:start w:val="1"/>
       <w:numFmt w:val="lowerRoman"/>
       <w:lvlText w:val="%3."/>
@@ -373,7 +345,7 @@
         <w:ind w:left="2160" w:hanging="180"/>
       </w:pPr>
     </w:lvl>
-    <w:lvl w:ilvl="3" w:tplc="0409000F" w:tentative="1">
+    <w:lvl w:ilvl="3" w:tplc="6BC4C622" w:tentative="1">
       <w:start w:val="1"/>
       <w:numFmt w:val="decimal"/>
       <w:lvlText w:val="%4."/>
@@ -382,7 +354,7 @@
         <w:ind w:left="2880" w:hanging="360"/>
       </w:pPr>
     </w:lvl>
-    <w:lvl w:ilvl="4" w:tplc="04090019" w:tentative="1">
+    <w:lvl w:ilvl="4" w:tplc="AD54F23A" w:tentative="1">
       <w:start w:val="1"/>
       <w:numFmt w:val="lowerLetter"/>
       <w:lvlText w:val="%5."/>
@@ -391,7 +363,7 @@
         <w:ind w:left="3600" w:hanging="360"/>
       </w:pPr>
     </w:lvl>
-    <w:lvl w:ilvl="5" w:tplc="0409001B" w:tentative="1">
+    <w:lvl w:ilvl="5" w:tplc="378441F8" w:tentative="1">
       <w:start w:val="1"/>
       <w:numFmt w:val="lowerRoman"/>
       <w:lvlText w:val="%6."/>
@@ -400,7 +372,7 @@
         <w:ind w:left="4320" w:hanging="180"/>
       </w:pPr>
     </w:lvl>
-    <w:lvl w:ilvl="6" w:tplc="0409000F" w:tentative="1">
+    <w:lvl w:ilvl="6" w:tplc="3B408942" w:tentative="1">
       <w:start w:val="1"/>
       <w:numFmt w:val="decimal"/>
       <w:lvlText w:val="%7."/>
@@ -409,7 +381,7 @@
         <w:ind w:left="5040" w:hanging="360"/>
       </w:pPr>
     </w:lvl>
-    <w:lvl w:ilvl="7" w:tplc="04090019" w:tentative="1">
+    <w:lvl w:ilvl="7" w:tplc="4C8C02D8" w:tentative="1">
       <w:start w:val="1"/>
       <w:numFmt w:val="lowerLetter"/>
       <w:lvlText w:val="%8."/>
@@ -418,7 +390,7 @@
         <w:ind w:left="5760" w:hanging="360"/>
       </w:pPr>
     </w:lvl>
-    <w:lvl w:ilvl="8" w:tplc="0409001B" w:tentative="1">
+    <w:lvl w:ilvl="8" w:tplc="7ED8C126" w:tentative="1">
       <w:start w:val="1"/>
       <w:numFmt w:val="lowerRoman"/>
       <w:lvlText w:val="%9."/>

</xml_diff>